<commit_message>
Fix System Overview Diagram and Doc Name
</commit_message>
<xml_diff>
--- a/PhishScope_MTech_Research_Synopsis_Final.docx
+++ b/PhishScope_MTech_Research_Synopsis_Final.docx
@@ -4124,6 +4124,50 @@
       <ns0:proofErr ns0:type="gramStart"/>
       <ns0:proofErr ns0:type="gramEnd"/>
     </ns0:p>
+    <ns0:p xmlns:ns0="http://schemas.openxmlformats.org/wordprocessingml/2006/main" xmlns:a="http://schemas.openxmlformats.org/drawingml/2006/main" xmlns:pic="http://schemas.openxmlformats.org/drawingml/2006/picture" xmlns:wp="http://schemas.openxmlformats.org/drawingml/2006/wordprocessingDrawing" xmlns:r="http://schemas.openxmlformats.org/officeDocument/2006/relationships">
+      <ns0:r>
+        <ns0:drawing>
+          <wp:inline>
+            <wp:extent cx="5334000" cy="3000375"/>
+            <wp:effectExtent b="0" l="0" r="0" t="0"/>
+            <wp:docPr descr="system_overview.jpg" title="" id="21" name="Picture"/>
+            <a:graphic>
+              <a:graphicData uri="http://schemas.openxmlformats.org/drawingml/2006/picture">
+                <pic:pic>
+                  <pic:nvPicPr>
+                    <pic:cNvPr descr="system_overview.jpg" id="22" name="Picture"/>
+                    <pic:cNvPicPr>
+                      <a:picLocks noChangeArrowheads="1" noChangeAspect="1"/>
+                    </pic:cNvPicPr>
+                  </pic:nvPicPr>
+                  <pic:blipFill>
+                    <a:blip r:embed="rIdImg999"/>
+                    <a:stretch>
+                      <a:fillRect/>
+                    </a:stretch>
+                  </pic:blipFill>
+                  <pic:spPr bwMode="auto">
+                    <a:xfrm>
+                      <a:off x="0" y="0"/>
+                      <a:ext cx="5334000" cy="3000375"/>
+                    </a:xfrm>
+                    <a:prstGeom prst="rect">
+                      <a:avLst/>
+                    </a:prstGeom>
+                    <a:noFill/>
+                    <a:ln w="9525">
+                      <a:noFill/>
+                      <a:headEnd/>
+                      <a:tailEnd/>
+                    </a:ln>
+                  </pic:spPr>
+                </pic:pic>
+              </a:graphicData>
+            </a:graphic>
+          </wp:inline>
+        </ns0:drawing>
+      </ns0:r>
+    </ns0:p>
     <ns0:p ns0:rsidR="004541E4" ns0:rsidRDefault="00C53AB4" ns0:rsidP="00DA0595">
       <ns0:pPr>
         <ns0:pStyle ns0:val="Heading1"/>

</xml_diff>